<commit_message>
Add non-blocking E-way Bill validity expiry alert + update changelog
</commit_message>
<xml_diff>
--- a/Material_Inward_Application_Summary 1.docx
+++ b/Material_Inward_Application_Summary 1.docx
@@ -4128,6 +4128,192 @@
                 <w:szCs w:val="20"/>
               </w:rPr>
               <w:t xml:space="preserve">_process_migo_103: moved the po_flow_type / Gate In / PO number lookup to the top of the function; for without_po flows, calls _process_update_gatein_po synchronously before execute_migo_103_sap instead of enqueueing update_gatein_po afterward; blocks MIGO 103 and returns a clean failure if the zgatein_update step fails.</w:t>
+            </w:r>
+          </w:p>
+        </w:tc>
+      </w:tr>
+    </w:tbl>
+    <w:p>
+      <w:pPr>
+        <w:pStyle w:val="Heading2"/>
+        <w:spacing w:after="100" w:before="240"/>
+      </w:pPr>
+      <w:r>
+        <w:rPr>
+          <w:color w:val="1F4E79"/>
+        </w:rPr>
+        <w:t xml:space="preserve">Change 8: E-way Bill validity expiry alert — Author: JATIN</w:t>
+      </w:r>
+    </w:p>
+    <w:p>
+      <w:pPr>
+        <w:spacing w:after="120"/>
+      </w:pPr>
+      <w:r>
+        <w:t xml:space="preserve">Date: July 16, 2026. Added a non-blocking alert for E-way Bills whose validity (“Valid Upto”) has already passed by the time a record is reviewed. Since documents are OCR’d only after goods have already physically arrived, this is informational for compliance awareness rather than preventive -- it does not block approval, Gate In, or any other workflow step. On every load of a record's Extracted Data tab, the server recomputes the expiry check fresh against the current date (not cached from OCR time), so a record that was valid when extracted but has since sat pending still gets flagged. The Validity Date field gets a persistent red highlight whenever expired, and a one-time-per-browser-session popup (reusing the existing showConfirm() modal) notifies the reviewer once per session, tracked via sessionStorage rather than a database flag to keep the change lightweight.</w:t>
+      </w:r>
+    </w:p>
+    <w:tbl>
+      <w:tblPr>
+        <w:tblW w:type="dxa" w:w="9360"/>
+        <w:tblBorders>
+          <w:top w:val="single" w:color="auto" w:sz="4"/>
+          <w:left w:val="single" w:color="auto" w:sz="4"/>
+          <w:bottom w:val="single" w:color="auto" w:sz="4"/>
+          <w:right w:val="single" w:color="auto" w:sz="4"/>
+          <w:insideH w:val="single" w:color="auto" w:sz="4"/>
+          <w:insideV w:val="single" w:color="auto" w:sz="4"/>
+        </w:tblBorders>
+      </w:tblPr>
+      <w:tblGrid>
+        <w:gridCol w:w="3000"/>
+        <w:gridCol w:w="6360"/>
+      </w:tblGrid>
+      <w:tr>
+        <w:trPr>
+          <w:tblHeader/>
+        </w:trPr>
+        <w:tc>
+          <w:tcPr>
+            <w:tcW w:type="dxa" w:w="3000"/>
+            <w:shd w:fill="1F4E79" w:val="clear"/>
+            <w:tcMar>
+              <w:top w:type="dxa" w:w="60"/>
+              <w:left w:type="dxa" w:w="100"/>
+              <w:bottom w:type="dxa" w:w="60"/>
+              <w:right w:type="dxa" w:w="100"/>
+            </w:tcMar>
+          </w:tcPr>
+          <w:p>
+            <w:r>
+              <w:rPr>
+                <w:b/>
+                <w:bCs/>
+                <w:color w:val="FFFFFF"/>
+                <w:sz w:val="20"/>
+                <w:szCs w:val="20"/>
+              </w:rPr>
+              <w:t xml:space="preserve">File</w:t>
+            </w:r>
+          </w:p>
+        </w:tc>
+        <w:tc>
+          <w:tcPr>
+            <w:tcW w:type="dxa" w:w="6360"/>
+            <w:shd w:fill="1F4E79" w:val="clear"/>
+            <w:tcMar>
+              <w:top w:type="dxa" w:w="60"/>
+              <w:left w:type="dxa" w:w="100"/>
+              <w:bottom w:type="dxa" w:w="60"/>
+              <w:right w:type="dxa" w:w="100"/>
+            </w:tcMar>
+          </w:tcPr>
+          <w:p>
+            <w:r>
+              <w:rPr>
+                <w:b/>
+                <w:bCs/>
+                <w:color w:val="FFFFFF"/>
+                <w:sz w:val="20"/>
+                <w:szCs w:val="20"/>
+              </w:rPr>
+              <w:t xml:space="preserve">Change made</w:t>
+            </w:r>
+          </w:p>
+        </w:tc>
+      </w:tr>
+      <w:tr>
+        <w:tc>
+          <w:tcPr>
+            <w:tcW w:type="dxa" w:w="3000"/>
+            <w:tcMar>
+              <w:top w:type="dxa" w:w="60"/>
+              <w:left w:type="dxa" w:w="100"/>
+              <w:bottom w:type="dxa" w:w="60"/>
+              <w:right w:type="dxa" w:w="100"/>
+            </w:tcMar>
+          </w:tcPr>
+          <w:p>
+            <w:r>
+              <w:rPr>
+                <w:b w:val="false"/>
+                <w:bCs w:val="false"/>
+                <w:color w:val="000000"/>
+                <w:sz w:val="20"/>
+                <w:szCs w:val="20"/>
+              </w:rPr>
+              <w:t xml:space="preserve">app.py</w:t>
+            </w:r>
+          </w:p>
+        </w:tc>
+        <w:tc>
+          <w:tcPr>
+            <w:tcW w:type="dxa" w:w="6360"/>
+            <w:tcMar>
+              <w:top w:type="dxa" w:w="60"/>
+              <w:left w:type="dxa" w:w="100"/>
+              <w:bottom w:type="dxa" w:w="60"/>
+              <w:right w:type="dxa" w:w="100"/>
+            </w:tcMar>
+          </w:tcPr>
+          <w:p>
+            <w:r>
+              <w:rPr>
+                <w:b w:val="false"/>
+                <w:bCs w:val="false"/>
+                <w:color w:val="000000"/>
+                <w:sz w:val="20"/>
+                <w:szCs w:val="20"/>
+              </w:rPr>
+              <w:t xml:space="preserve">view_detail(): added ewb_expired computation -- compares today's server date (date.today()) against ewaybill_data.validity_date (already normalized to YYYY-MM-DD by services/extract.py) using a date-only comparison; passes ewb_expired into the index.html render_template() call alongside the existing ewaybill_data argument. Non-parseable or missing validity_date defaults to not-expired rather than raising.</w:t>
+            </w:r>
+          </w:p>
+        </w:tc>
+      </w:tr>
+      <w:tr>
+        <w:tc>
+          <w:tcPr>
+            <w:tcW w:type="dxa" w:w="3000"/>
+            <w:tcMar>
+              <w:top w:type="dxa" w:w="60"/>
+              <w:left w:type="dxa" w:w="100"/>
+              <w:bottom w:type="dxa" w:w="60"/>
+              <w:right w:type="dxa" w:w="100"/>
+            </w:tcMar>
+          </w:tcPr>
+          <w:p>
+            <w:r>
+              <w:rPr>
+                <w:b w:val="false"/>
+                <w:bCs w:val="false"/>
+                <w:color w:val="000000"/>
+                <w:sz w:val="20"/>
+                <w:szCs w:val="20"/>
+              </w:rPr>
+              <w:t xml:space="preserve">templates/tabs/extracted_data.html</w:t>
+            </w:r>
+          </w:p>
+        </w:tc>
+        <w:tc>
+          <w:tcPr>
+            <w:tcW w:type="dxa" w:w="6360"/>
+            <w:tcMar>
+              <w:top w:type="dxa" w:w="60"/>
+              <w:left w:type="dxa" w:w="100"/>
+              <w:bottom w:type="dxa" w:w="60"/>
+              <w:right w:type="dxa" w:w="100"/>
+            </w:tcMar>
+          </w:tcPr>
+          <w:p>
+            <w:r>
+              <w:rPr>
+                <w:b w:val="false"/>
+                <w:bCs w:val="false"/>
+                <w:color w:val="000000"/>
+                <w:sz w:val="20"/>
+                <w:szCs w:val="20"/>
+              </w:rPr>
+              <w:t xml:space="preserve">Added .field-expired CSS rule (red border + light red background, styled to match the existing .approval-banner.hold red used elsewhere in this file). The #eway_validity_date input now gets this class whenever ewb_expired is true, so the field stays visibly highlighted every time the tab is viewed while the E-way Bill remains expired. Added a DOMContentLoaded script block that checks ewb_expired and a per-record sessionStorage key (ewb_expiry_alert_shown_&lt;history_id&gt;); if expired and not yet shown this browser session, it triggers the existing showConfirm() modal (reused as a plain acknowledgment notice, no destructive action attached) naming the expired validity date, then sets the sessionStorage key so it will not repeat within the same session. Purely informational -- does not block approval, editing, or any workflow step; no database schema change.</w:t>
             </w:r>
           </w:p>
         </w:tc>

</xml_diff>